<commit_message>
Adatbázis tervek és adatbázis átvariálása ehez igazitottam a kodot
</commit_message>
<xml_diff>
--- a/Tervezés/Adatbázis_terv_project/Adatbázis terv dokumentáció.docx
+++ b/Tervezés/Adatbázis_terv_project/Adatbázis terv dokumentáció.docx
@@ -45,7 +45,12 @@
     <w:p>
       <w:r>
         <w:tab/>
-        <w:t xml:space="preserve">Tasks: Ez a tábla fogja </w:t>
+      </w:r>
+      <w:r>
+        <w:t>Activities</w:t>
+      </w:r>
+      <w:r>
+        <w:t xml:space="preserve">: Ez a tábla fogja </w:t>
       </w:r>
       <w:r>
         <w:t>tárolni</w:t>
@@ -53,11 +58,8 @@
       <w:r>
         <w:t xml:space="preserve"> a napi teendőlista feladatait</w:t>
       </w:r>
-    </w:p>
-    <w:p>
-      <w:r>
-        <w:tab/>
-        <w:t>Habits: Ez a tábla fogja kezelni a felhasználó által felvett szokásokat</w:t>
+      <w:r>
+        <w:t xml:space="preserve"> és a szokásokat</w:t>
       </w:r>
     </w:p>
     <w:p>
@@ -100,55 +102,11 @@
         <w:t>: Ez fogja a taskok és habitokhoz tartozó nehézségi szinteket tartalmazni. (könnyű, közepes, nehéz)</w:t>
       </w:r>
     </w:p>
-    <w:p/>
-    <w:p>
-      <w:pPr>
-        <w:rPr>
-          <w:rFonts w:ascii="Arial" w:hAnsi="Arial" w:cs="Arial"/>
-          <w:sz w:val="32"/>
-          <w:szCs w:val="32"/>
-        </w:rPr>
-      </w:pPr>
-      <w:r>
-        <w:rPr>
-          <w:rFonts w:ascii="Arial" w:hAnsi="Arial" w:cs="Arial"/>
-          <w:sz w:val="32"/>
-          <w:szCs w:val="32"/>
-        </w:rPr>
-        <w:t xml:space="preserve">Kapcsoló táblák: </w:t>
-      </w:r>
-    </w:p>
-    <w:p>
-      <w:r>
-        <w:tab/>
-        <w:t>Users_Tasks:</w:t>
-      </w:r>
-      <w:r>
-        <w:t xml:space="preserve"> </w:t>
-      </w:r>
-      <w:r>
-        <w:t xml:space="preserve">A user_id ját és a task_idját összeköti </w:t>
-      </w:r>
-    </w:p>
-    <w:p>
-      <w:r>
-        <w:tab/>
-        <w:t xml:space="preserve">Users_Habits: </w:t>
-      </w:r>
-      <w:r>
-        <w:t>A user_id ját és a habit_id ját összeköti</w:t>
-      </w:r>
-    </w:p>
-    <w:p>
-      <w:r>
-        <w:tab/>
-        <w:t>Users_Events:</w:t>
-      </w:r>
-      <w:r>
-        <w:t xml:space="preserve"> A user_id ját és az event_id ját összeköti</w:t>
-      </w:r>
-    </w:p>
-    <w:p/>
+    <w:p>
+      <w:pPr>
+        <w:ind w:left="705"/>
+      </w:pPr>
+    </w:p>
     <w:p>
       <w:pPr>
         <w:rPr>
@@ -177,16 +135,34 @@
         <w:t>s</w:t>
       </w:r>
       <w:r>
-        <w:t xml:space="preserve"> és a Task</w:t>
-      </w:r>
-      <w:r>
-        <w:t>s</w:t>
-      </w:r>
-      <w:r>
-        <w:t xml:space="preserve"> között: N:M Egy </w:t>
-      </w:r>
-      <w:r>
-        <w:t>felhasználó több teendőt felvehet és egy teendőhöz több felhasználó is tartozhat a redundancia (túlzott ismétlődés) csökkentése érdekében.</w:t>
+        <w:t xml:space="preserve"> és a</w:t>
+      </w:r>
+      <w:r>
+        <w:t xml:space="preserve">z Activities </w:t>
+      </w:r>
+      <w:r>
+        <w:t xml:space="preserve">között: </w:t>
+      </w:r>
+      <w:r>
+        <w:t>1:N</w:t>
+      </w:r>
+      <w:r>
+        <w:t xml:space="preserve"> Egy </w:t>
+      </w:r>
+      <w:r>
+        <w:t>felhasználó több teendőt</w:t>
+      </w:r>
+      <w:r>
+        <w:t xml:space="preserve"> vagy szokást </w:t>
+      </w:r>
+      <w:r>
+        <w:t xml:space="preserve"> felvehet és egy teendőhöz</w:t>
+      </w:r>
+      <w:r>
+        <w:t xml:space="preserve"> vagy </w:t>
+      </w:r>
+      <w:r>
+        <w:t>szokáshoz egy felhasználó tertozhat</w:t>
       </w:r>
     </w:p>
     <w:p>
@@ -194,21 +170,27 @@
         <w:ind w:left="705"/>
       </w:pPr>
       <w:r>
-        <w:t>Users és a Habits között: N:M Egy felhasználó több szokást is felvehet és egy szokáshoz több felhasználó is tartozhat a redundancia (túlzott ismétlődés) csökkentése érdekében.</w:t>
-      </w:r>
-    </w:p>
-    <w:p>
-      <w:pPr>
-        <w:ind w:left="705"/>
-      </w:pPr>
-      <w:r>
-        <w:t>Users és a Events között: N:M Egy felhasználó több eseményt is felvehet és egy eseményhez több felhasználó is tartozhat a redundancia (túlzott ismétlődés) csökkentése érdekében.</w:t>
-      </w:r>
-    </w:p>
-    <w:p>
-      <w:r>
-        <w:tab/>
-        <w:t xml:space="preserve">Tasks és a Types között: </w:t>
+        <w:t xml:space="preserve">Users és a Events között: </w:t>
+      </w:r>
+      <w:r>
+        <w:t>1:N</w:t>
+      </w:r>
+      <w:r>
+        <w:t xml:space="preserve"> Egy felhasználó több eseményt is felvehet és egy eseményhez </w:t>
+      </w:r>
+      <w:r>
+        <w:t>egy felhasználó tartozik</w:t>
+      </w:r>
+    </w:p>
+    <w:p>
+      <w:r>
+        <w:tab/>
+      </w:r>
+      <w:r>
+        <w:t xml:space="preserve">Activity </w:t>
+      </w:r>
+      <w:r>
+        <w:t xml:space="preserve">és a Types között: </w:t>
       </w:r>
       <w:r>
         <w:t>N</w:t>
@@ -232,7 +214,12 @@
     <w:p>
       <w:r>
         <w:tab/>
-        <w:t xml:space="preserve">Tasks és a Difficulties között: </w:t>
+      </w:r>
+      <w:r>
+        <w:t xml:space="preserve">Activity </w:t>
+      </w:r>
+      <w:r>
+        <w:t xml:space="preserve">és a Difficulties között: </w:t>
       </w:r>
       <w:r>
         <w:t>N</w:t>
@@ -251,55 +238,6 @@
       </w:r>
       <w:r>
         <w:t>höz csak egy nehézség tartozhat.</w:t>
-      </w:r>
-    </w:p>
-    <w:p>
-      <w:r>
-        <w:tab/>
-        <w:t xml:space="preserve">Habits és a Types között: </w:t>
-      </w:r>
-      <w:r>
-        <w:t>N</w:t>
-      </w:r>
-      <w:r>
-        <w:t xml:space="preserve">:1 </w:t>
-      </w:r>
-      <w:r>
-        <w:t xml:space="preserve">A </w:t>
-      </w:r>
-      <w:r>
-        <w:t>szokás</w:t>
-      </w:r>
-      <w:r>
-        <w:t>ok</w:t>
-      </w:r>
-      <w:r>
-        <w:t>hoz csak egy típus tartozhat.</w:t>
-      </w:r>
-    </w:p>
-    <w:p>
-      <w:r>
-        <w:lastRenderedPageBreak/>
-        <w:tab/>
-        <w:t xml:space="preserve">Habits és a Difficulties között: </w:t>
-      </w:r>
-      <w:r>
-        <w:t>N</w:t>
-      </w:r>
-      <w:r>
-        <w:t xml:space="preserve">:1 </w:t>
-      </w:r>
-      <w:r>
-        <w:t xml:space="preserve">A </w:t>
-      </w:r>
-      <w:r>
-        <w:t>szokás</w:t>
-      </w:r>
-      <w:r>
-        <w:t>ok</w:t>
-      </w:r>
-      <w:r>
-        <w:t>hoz csak egy nehézség tartozhat.</w:t>
       </w:r>
     </w:p>
     <w:p/>
@@ -382,7 +320,13 @@
         <w:t xml:space="preserve">language: </w:t>
       </w:r>
       <w:r>
-        <w:t>VRCHAR A felhasználó által kiválasztót nyelv</w:t>
+        <w:t>V</w:t>
+      </w:r>
+      <w:r>
+        <w:t>A</w:t>
+      </w:r>
+      <w:r>
+        <w:t>RCHAR A felhasználó által kiválasztót nyelv</w:t>
       </w:r>
     </w:p>
     <w:p>
@@ -405,6 +349,7 @@
     </w:p>
     <w:p>
       <w:r>
+        <w:lastRenderedPageBreak/>
         <w:tab/>
       </w:r>
       <w:r>
@@ -412,16 +357,40 @@
           <w:sz w:val="28"/>
           <w:szCs w:val="28"/>
         </w:rPr>
-        <w:t>Users_Tasks:</w:t>
-      </w:r>
-    </w:p>
-    <w:p>
-      <w:r>
-        <w:tab/>
-      </w:r>
-      <w:r>
-        <w:tab/>
-      </w:r>
+        <w:t>Activities</w:t>
+      </w:r>
+      <w:r>
+        <w:rPr>
+          <w:sz w:val="28"/>
+          <w:szCs w:val="28"/>
+        </w:rPr>
+        <w:t>:</w:t>
+      </w:r>
+    </w:p>
+    <w:p>
+      <w:pPr>
+        <w:ind w:left="1416"/>
+      </w:pPr>
+      <w:r>
+        <w:rPr>
+          <w:u w:val="single"/>
+        </w:rPr>
+        <w:t>activity</w:t>
+      </w:r>
+      <w:r>
+        <w:rPr>
+          <w:u w:val="single"/>
+        </w:rPr>
+        <w:t>_id:</w:t>
+      </w:r>
+      <w:r>
+        <w:t xml:space="preserve"> INT Elsődleges kulcs a teendő egyedi azonosítóját tartalmazza</w:t>
+      </w:r>
+    </w:p>
+    <w:p>
+      <w:pPr>
+        <w:ind w:left="1416"/>
+      </w:pPr>
       <w:r>
         <w:rPr>
           <w:u w:val="single"/>
@@ -429,45 +398,7 @@
         <w:t>user_id:</w:t>
       </w:r>
       <w:r>
-        <w:t xml:space="preserve"> INT Idegen kulcs az </w:t>
-      </w:r>
-      <w:r>
-        <w:t xml:space="preserve">felhasználó </w:t>
-      </w:r>
-      <w:r>
-        <w:t xml:space="preserve">egyedi </w:t>
-      </w:r>
-      <w:r>
-        <w:t>azonosítóját tartalmazza</w:t>
-      </w:r>
-    </w:p>
-    <w:p>
-      <w:r>
-        <w:tab/>
-      </w:r>
-      <w:r>
-        <w:tab/>
-      </w:r>
-      <w:r>
-        <w:rPr>
-          <w:u w:val="single"/>
-        </w:rPr>
-        <w:t>task_id:</w:t>
-      </w:r>
-      <w:r>
-        <w:t xml:space="preserve"> INT Idegen kulcs a teendő egyedi azonosítóját tartalmazza</w:t>
-      </w:r>
-    </w:p>
-    <w:p>
-      <w:r>
-        <w:tab/>
-      </w:r>
-      <w:r>
-        <w:rPr>
-          <w:sz w:val="28"/>
-          <w:szCs w:val="28"/>
-        </w:rPr>
-        <w:t>Tasks:</w:t>
+        <w:t xml:space="preserve"> INT Idegen kulcs a felhasználó azonosítója</w:t>
       </w:r>
     </w:p>
     <w:p>
@@ -475,13 +406,13 @@
         <w:ind w:left="1416"/>
       </w:pPr>
       <w:r>
-        <w:rPr>
-          <w:u w:val="single"/>
-        </w:rPr>
-        <w:t>task_id:</w:t>
-      </w:r>
-      <w:r>
-        <w:t xml:space="preserve"> INT Elsődleges kulcs a teendő egyedi azonosítóját tartalmazza</w:t>
+        <w:t>activity</w:t>
+      </w:r>
+      <w:r>
+        <w:t>_</w:t>
+      </w:r>
+      <w:r>
+        <w:t>name: VARCHAR A teendő nevét tartalmazza</w:t>
       </w:r>
     </w:p>
     <w:p>
@@ -489,10 +420,13 @@
         <w:ind w:left="1416"/>
       </w:pPr>
       <w:r>
-        <w:t>task_</w:t>
-      </w:r>
-      <w:r>
-        <w:t>name: VARCHAR A teendő nevét tartalmazza</w:t>
+        <w:t>activity</w:t>
+      </w:r>
+      <w:r>
+        <w:t>_</w:t>
+      </w:r>
+      <w:r>
+        <w:t>type_id: INT Idegen kulcs a típus egyedi azonosítóját tartalmazza</w:t>
       </w:r>
     </w:p>
     <w:p>
@@ -500,10 +434,13 @@
         <w:ind w:left="1416"/>
       </w:pPr>
       <w:r>
-        <w:t>task_</w:t>
-      </w:r>
-      <w:r>
-        <w:t>type_id: INT Idegen kulcs a típus egyedi azonosítóját tartalmazza</w:t>
+        <w:t>activity</w:t>
+      </w:r>
+      <w:r>
+        <w:t>_</w:t>
+      </w:r>
+      <w:r>
+        <w:t>difficulty_id: INT Idegen kulcs a nehézségi szint egyedi azonosítóját tartalmazza</w:t>
       </w:r>
     </w:p>
     <w:p>
@@ -511,10 +448,16 @@
         <w:ind w:left="1416"/>
       </w:pPr>
       <w:r>
-        <w:t>task_</w:t>
-      </w:r>
-      <w:r>
-        <w:t>difficulty_id: INT Idegen kulcs a nehézségi szint egyedi azonosítóját tartalmazza</w:t>
+        <w:t>activity</w:t>
+      </w:r>
+      <w:r>
+        <w:t>_achive: BOOLE</w:t>
+      </w:r>
+      <w:r>
+        <w:t>A</w:t>
+      </w:r>
+      <w:r>
+        <w:t>N Ha elkészítette a teendőt akkor igaz értéke lesz</w:t>
       </w:r>
     </w:p>
     <w:p>
@@ -522,7 +465,22 @@
         <w:ind w:left="1416"/>
       </w:pPr>
       <w:r>
-        <w:t>task_achieve: BOOLEEN Ha elkészítette a teendőt akkor igaz értéke lesz</w:t>
+        <w:t>activity_start_date</w:t>
+      </w:r>
+      <w:r>
+        <w:t>: DATE</w:t>
+      </w:r>
+      <w:r>
+        <w:t xml:space="preserve"> </w:t>
+      </w:r>
+      <w:r>
+        <w:t xml:space="preserve"> </w:t>
+      </w:r>
+      <w:r>
+        <w:t>Azt a napot fogja tartalmazni amelyikhez beirta</w:t>
+      </w:r>
+      <w:r>
+        <w:t xml:space="preserve"> hogy kezdődjön</w:t>
       </w:r>
     </w:p>
     <w:p>
@@ -530,11 +488,33 @@
         <w:ind w:left="1416"/>
       </w:pPr>
       <w:r>
-        <w:t xml:space="preserve">task_day: DATETIME </w:t>
-      </w:r>
-      <w:r>
-        <w:t>Azt a napot fogja tartalmazni amelyikhez beirta</w:t>
-      </w:r>
+        <w:t xml:space="preserve">activity_end_date: </w:t>
+      </w:r>
+      <w:r>
+        <w:t>DATE</w:t>
+      </w:r>
+      <w:r>
+        <w:t xml:space="preserve"> </w:t>
+      </w:r>
+      <w:r>
+        <w:t xml:space="preserve"> Azt a napot fogja tartalmazni amelyikhez beirta hogy </w:t>
+      </w:r>
+      <w:r>
+        <w:t>végződjön</w:t>
+      </w:r>
+    </w:p>
+    <w:p>
+      <w:pPr>
+        <w:ind w:left="1416"/>
+      </w:pPr>
+      <w:r>
+        <w:t>progress_counter: INT Azt tartalmazza hogy hány napon sikerült teljesiteni a szokást</w:t>
+      </w:r>
+    </w:p>
+    <w:p>
+      <w:pPr>
+        <w:ind w:left="1416"/>
+      </w:pPr>
     </w:p>
     <w:p>
       <w:r>
@@ -599,7 +579,6 @@
         <w:rPr>
           <w:u w:val="single"/>
         </w:rPr>
-        <w:lastRenderedPageBreak/>
         <w:t>difficulty_id:</w:t>
       </w:r>
       <w:r>
@@ -624,197 +603,6 @@
       </w:r>
       <w:r>
         <w:t>name: VARCHAR A nehézségi szint nevét tartalmazza</w:t>
-      </w:r>
-    </w:p>
-    <w:p>
-      <w:r>
-        <w:tab/>
-      </w:r>
-      <w:r>
-        <w:rPr>
-          <w:sz w:val="28"/>
-          <w:szCs w:val="28"/>
-        </w:rPr>
-        <w:t>Users_Habits:</w:t>
-      </w:r>
-    </w:p>
-    <w:p>
-      <w:r>
-        <w:tab/>
-      </w:r>
-      <w:r>
-        <w:tab/>
-      </w:r>
-      <w:r>
-        <w:rPr>
-          <w:u w:val="single"/>
-        </w:rPr>
-        <w:t>user_id:</w:t>
-      </w:r>
-      <w:r>
-        <w:t xml:space="preserve"> INT Idegen kulcs a felhasználó egyedi azonosítóját tartalmazza</w:t>
-      </w:r>
-    </w:p>
-    <w:p>
-      <w:pPr>
-        <w:ind w:left="708" w:firstLine="708"/>
-      </w:pPr>
-      <w:r>
-        <w:rPr>
-          <w:u w:val="single"/>
-        </w:rPr>
-        <w:t>habit_id:</w:t>
-      </w:r>
-      <w:r>
-        <w:t xml:space="preserve"> INT Idegen kulcs a szokás egyedi azonosítóját tartalmazza</w:t>
-      </w:r>
-    </w:p>
-    <w:p>
-      <w:r>
-        <w:tab/>
-      </w:r>
-      <w:r>
-        <w:rPr>
-          <w:sz w:val="28"/>
-          <w:szCs w:val="28"/>
-        </w:rPr>
-        <w:t>Habits:</w:t>
-      </w:r>
-    </w:p>
-    <w:p>
-      <w:r>
-        <w:tab/>
-      </w:r>
-      <w:r>
-        <w:tab/>
-      </w:r>
-      <w:r>
-        <w:rPr>
-          <w:u w:val="single"/>
-        </w:rPr>
-        <w:t>habit_id:</w:t>
-      </w:r>
-      <w:r>
-        <w:t xml:space="preserve"> INT Elsődleges kulcs a szokás egyedi azonosítóját tartalmazza</w:t>
-      </w:r>
-    </w:p>
-    <w:p>
-      <w:pPr>
-        <w:ind w:left="1416"/>
-      </w:pPr>
-      <w:r>
-        <w:t>habit_</w:t>
-      </w:r>
-      <w:r>
-        <w:t>name: VARCHAR A szokás nevét tartalmazza</w:t>
-      </w:r>
-    </w:p>
-    <w:p>
-      <w:pPr>
-        <w:ind w:left="708" w:firstLine="708"/>
-      </w:pPr>
-      <w:r>
-        <w:t>habit_</w:t>
-      </w:r>
-      <w:r>
-        <w:t>type_id: INT Idegen kulcs a típus egyedi azonosítóját tartalmazza</w:t>
-      </w:r>
-    </w:p>
-    <w:p>
-      <w:pPr>
-        <w:ind w:left="1416"/>
-      </w:pPr>
-      <w:r>
-        <w:t>habit_</w:t>
-      </w:r>
-      <w:r>
-        <w:t xml:space="preserve">difficulty_id: </w:t>
-      </w:r>
-      <w:r>
-        <w:t>INT Idegen kulcs a nehézségi szint egyedi azonosítóját</w:t>
-      </w:r>
-      <w:r>
-        <w:t xml:space="preserve"> </w:t>
-      </w:r>
-      <w:r>
-        <w:t>tartalmazza</w:t>
-      </w:r>
-    </w:p>
-    <w:p>
-      <w:pPr>
-        <w:ind w:left="1416"/>
-      </w:pPr>
-      <w:r>
-        <w:t>habit_</w:t>
-      </w:r>
-      <w:r>
-        <w:t>target_days</w:t>
-      </w:r>
-      <w:r>
-        <w:t>: INT A szokás célidejét tartalmazza</w:t>
-      </w:r>
-      <w:r>
-        <w:t xml:space="preserve"> napban</w:t>
-      </w:r>
-      <w:r>
-        <w:t xml:space="preserve">. </w:t>
-      </w:r>
-      <w:r>
-        <w:t xml:space="preserve">Hány napon </w:t>
-      </w:r>
-      <w:r>
-        <w:t>át akarja teljesíteni</w:t>
-      </w:r>
-    </w:p>
-    <w:p>
-      <w:pPr>
-        <w:ind w:left="1416"/>
-      </w:pPr>
-      <w:r>
-        <w:t>habit_create_date: DATETIME A szokás létrehozásának időpontját tárolja</w:t>
-      </w:r>
-    </w:p>
-    <w:p>
-      <w:r>
-        <w:tab/>
-      </w:r>
-      <w:r>
-        <w:rPr>
-          <w:sz w:val="28"/>
-          <w:szCs w:val="28"/>
-        </w:rPr>
-        <w:t>Users_Events:</w:t>
-      </w:r>
-    </w:p>
-    <w:p>
-      <w:r>
-        <w:tab/>
-      </w:r>
-      <w:r>
-        <w:tab/>
-      </w:r>
-      <w:r>
-        <w:rPr>
-          <w:u w:val="single"/>
-        </w:rPr>
-        <w:t>user_id:</w:t>
-      </w:r>
-      <w:r>
-        <w:t xml:space="preserve"> INT Idegen kulcs a felhasználó egyedi azonosítóját tartalmazza</w:t>
-      </w:r>
-    </w:p>
-    <w:p>
-      <w:pPr>
-        <w:ind w:left="708" w:firstLine="708"/>
-      </w:pPr>
-      <w:r>
-        <w:rPr>
-          <w:u w:val="single"/>
-        </w:rPr>
-        <w:t>event_id:</w:t>
-      </w:r>
-      <w:r>
-        <w:t xml:space="preserve"> INT Idegen kulcs az esemény egyedi azonosítóját tartalmazza</w:t>
       </w:r>
     </w:p>
     <w:p>
@@ -845,6 +633,20 @@
     </w:p>
     <w:p>
       <w:pPr>
+        <w:ind w:left="1410"/>
+      </w:pPr>
+      <w:r>
+        <w:rPr>
+          <w:u w:val="single"/>
+        </w:rPr>
+        <w:t>user_id:</w:t>
+      </w:r>
+      <w:r>
+        <w:t xml:space="preserve"> INT Idegen kulcs az eseményt létrehozó felhasználó azonosítója</w:t>
+      </w:r>
+    </w:p>
+    <w:p>
+      <w:pPr>
         <w:ind w:left="708" w:firstLine="708"/>
       </w:pPr>
       <w:r>
@@ -876,7 +678,7 @@
         <w:ind w:left="708" w:firstLine="708"/>
       </w:pPr>
       <w:r>
-        <w:t>event_end _time</w:t>
+        <w:t>event_end_time</w:t>
       </w:r>
       <w:r>
         <w:t>: DATETIME Az esemény</w:t>
@@ -887,11 +689,6 @@
       <w:r>
         <w:t>időpontját tartalmazza</w:t>
       </w:r>
-    </w:p>
-    <w:p>
-      <w:pPr>
-        <w:ind w:left="708" w:firstLine="708"/>
-      </w:pPr>
     </w:p>
     <w:sectPr>
       <w:pgSz w:w="11906" w:h="16838"/>

</xml_diff>